<commit_message>
fix: teste cruzado vira 'colega simulado' — formador controla a sessao
Pedagogia corrigida (observacao do formador): usar o prompt de um colega
fora de contexto nao tem interesse para quem testa, e prompts de servico
nao sao executaveis por terceiros. O sinal pretendido (que perguntas
faria um leitor a frio?) obtem-se a ler, nao a executar.

- seccao reescrita: o Copilot faz de colega 'a frio' em conversa nova;
  ciclo corrigir-repetir ate 'este prompt e autossuficiente'; cada
  formando testa os seus 3 prompts individualmente (sem breakout rooms,
  sem emparelhamento — o formador controla o relogio)
- prompt-testador vira entrada #7 da biblioteca (pagina + DOCX)
- regra da partilha atualizada: so entra o que o colega simulado aprovou
- terceira aparicao do padrao 'IA a melhorar o uso da IA' (meta-prompt,
  auto-critica, colega simulado)

Co-Authored-By: Claude Opus 4.8 (1M context) <noreply@anthropic.com>
</commit_message>
<xml_diff>
--- a/sessoes/sessao-03/Biblioteca_de_Prompts.docx
+++ b/sessoes/sessao-03/Biblioteca_de_Prompts.docx
@@ -1214,12 +1214,165 @@
           <w:color w:val="1F4E78"/>
           <w:sz w:val="26"/>
         </w:rPr>
+        <w:t>Entrada #7 — O colega simulado (testador de prompts)</w:t>
+      </w:r>
+    </w:p>
+    <w:tbl>
+      <w:tblPr>
+        <w:tblStyle w:val="TableGrid"/>
+        <w:tblW w:type="auto" w:w="0"/>
+        <w:tblLook w:firstColumn="1" w:firstRow="1" w:lastColumn="0" w:lastRow="0" w:noHBand="0" w:noVBand="1" w:val="04A0"/>
+      </w:tblPr>
+      <w:tblGrid>
+        <w:gridCol w:w="1984"/>
+        <w:gridCol w:w="7654"/>
+      </w:tblGrid>
+      <w:tr>
+        <w:tc>
+          <w:tcPr>
+            <w:tcW w:type="dxa" w:w="4986"/>
+            <w:shd w:val="clear" w:fill="D9E2F3"/>
+          </w:tcPr>
+          <w:p>
+            <w:r/>
+            <w:r>
+              <w:rPr>
+                <w:b/>
+                <w:color w:val="1F4E78"/>
+              </w:rPr>
+              <w:t>Nome</w:t>
+            </w:r>
+          </w:p>
+        </w:tc>
+        <w:tc>
+          <w:tcPr>
+            <w:tcW w:type="dxa" w:w="4986"/>
+          </w:tcPr>
+          <w:p>
+            <w:r/>
+            <w:r>
+              <w:rPr>
+                <w:sz w:val="20"/>
+              </w:rPr>
+              <w:t>Colega simulado (testador de prompts)</w:t>
+            </w:r>
+          </w:p>
+        </w:tc>
+      </w:tr>
+      <w:tr>
+        <w:tc>
+          <w:tcPr>
+            <w:tcW w:type="dxa" w:w="4986"/>
+            <w:shd w:val="clear" w:fill="D9E2F3"/>
+          </w:tcPr>
+          <w:p>
+            <w:r/>
+            <w:r>
+              <w:rPr>
+                <w:b/>
+                <w:color w:val="1F4E78"/>
+              </w:rPr>
+              <w:t>Quando usar</w:t>
+            </w:r>
+          </w:p>
+        </w:tc>
+        <w:tc>
+          <w:tcPr>
+            <w:tcW w:type="dxa" w:w="4986"/>
+          </w:tcPr>
+          <w:p>
+            <w:r/>
+            <w:r>
+              <w:rPr>
+                <w:sz w:val="20"/>
+              </w:rPr>
+              <w:t>Antes de dar um prompt por pronto ou de o partilhar com a equipa. Usar numa conversa nova, para o Copilot ler o prompt "a frio".</w:t>
+            </w:r>
+          </w:p>
+        </w:tc>
+      </w:tr>
+      <w:tr>
+        <w:tc>
+          <w:tcPr>
+            <w:tcW w:type="dxa" w:w="4986"/>
+            <w:shd w:val="clear" w:fill="D9E2F3"/>
+          </w:tcPr>
+          <w:p>
+            <w:r/>
+            <w:r>
+              <w:rPr>
+                <w:b/>
+                <w:color w:val="1F4E78"/>
+              </w:rPr>
+              <w:t>Prompt</w:t>
+            </w:r>
+          </w:p>
+        </w:tc>
+        <w:tc>
+          <w:tcPr>
+            <w:tcW w:type="dxa" w:w="4986"/>
+          </w:tcPr>
+          <w:p>
+            <w:r/>
+            <w:r>
+              <w:rPr>
+                <w:sz w:val="20"/>
+              </w:rPr>
+              <w:t>Recebeste este prompt de um colega de outro serviço, sem qualquer contexto. Antes de o usares, que perguntas terias de lhe fazer? Lista-as por ordem de importância e indica que componente falha em cada uma (Objetivo, Contexto, Fonte ou Expectativas). Se não houver perguntas a fazer, responde apenas: "este prompt é autossuficiente".</w:t>
+              <w:br/>
+              <w:br/>
+              <w:t>Prompt recebido: [colar]</w:t>
+            </w:r>
+          </w:p>
+        </w:tc>
+      </w:tr>
+      <w:tr>
+        <w:tc>
+          <w:tcPr>
+            <w:tcW w:type="dxa" w:w="4986"/>
+            <w:shd w:val="clear" w:fill="D9E2F3"/>
+          </w:tcPr>
+          <w:p>
+            <w:r/>
+            <w:r>
+              <w:rPr>
+                <w:b/>
+                <w:color w:val="1F4E78"/>
+              </w:rPr>
+              <w:t>Validação</w:t>
+            </w:r>
+          </w:p>
+        </w:tc>
+        <w:tc>
+          <w:tcPr>
+            <w:tcW w:type="dxa" w:w="4986"/>
+          </w:tcPr>
+          <w:p>
+            <w:r/>
+            <w:r>
+              <w:rPr>
+                <w:sz w:val="20"/>
+              </w:rPr>
+              <w:t>Corrigir o prompt com base nas perguntas devolvidas e repetir o teste até obter "este prompt é autossuficiente". Só então partilhar.</w:t>
+            </w:r>
+          </w:p>
+        </w:tc>
+      </w:tr>
+    </w:tbl>
+    <w:p/>
+    <w:p>
+      <w:r>
+        <w:rPr>
+          <w:b/>
+          <w:color w:val="1F4E78"/>
+          <w:sz w:val="26"/>
+        </w:rPr>
         <w:t>Entradas seguintes</w:t>
       </w:r>
     </w:p>
     <w:p>
       <w:r>
-        <w:t>A biblioteca cresce com a prática: sempre que escrever um prompt que funcionou, acrescente-o aqui com os quatro campos. Antes de o partilhar com a equipa, faça-lhe o teste cruzado da Sessão 3: outra pessoa consegue usá-lo sem lhe fazer perguntas?</w:t>
+        <w:t>A biblioteca cresce com a prática: sempre que escrever um prompt que funcionou, acrescente-o aqui com os quatro campos. Antes de o partilhar com a equipa, faça-o passar pelo colega simulado (entrada #7): quando o teste devolver "este prompt é autossuficiente", está pronto.</w:t>
       </w:r>
     </w:p>
     <w:sectPr>

</xml_diff>

<commit_message>
﻿feat: S03 - ficheiro-biblioteca com as 8 entradas preenchidas
Entradas #1-#5 (Resumir, Redigir, Reformular, Analisar, Preparar)
preenchidas com prompts completos ancorados em tarefas tipicas de IES;
nota "Como usar" e referencias na pagina da sessao atualizadas.

Co-Authored-By: Claude Fable 5 <noreply@anthropic.com>
</commit_message>
<xml_diff>
--- a/sessoes/sessao-03/Biblioteca_de_Prompts.docx
+++ b/sessoes/sessao-03/Biblioteca_de_Prompts.docx
@@ -69,6 +69,9 @@
       </w:pPr>
       <w:r>
         <w:t>A entrada #0 já vem preenchida: é o meta-prompt da Sessão 3 — o prompt que ajuda a criar todos os outros. Use-o para construir as entradas seguintes.</w:t>
+      </w:r>
+      <w:r>
+        <w:t xml:space="preserve"> As entradas #1 a #5 também já vêm preenchidas, com exemplos típicos do trabalho administrativo em IES — adapte nomes de serviços, procedimentos e vocabulário à sua realidade antes de as usar.</w:t>
       </w:r>
     </w:p>
     <w:p>
@@ -292,14 +295,8 @@
             <w:tcW w:type="dxa" w:w="4986"/>
           </w:tcPr>
           <w:p>
-            <w:r/>
             <w:r>
-              <w:rPr>
-                <w:i/>
-                <w:color w:val="757575"/>
-                <w:sz w:val="18"/>
-              </w:rPr>
-              <w:t>Ex.: um nome curto que descreva a tarefa de resumir</w:t>
+              <w:t>Resumo de cadeia de e-mails com pendências</w:t>
             </w:r>
           </w:p>
         </w:tc>
@@ -326,14 +323,8 @@
             <w:tcW w:type="dxa" w:w="4986"/>
           </w:tcPr>
           <w:p>
-            <w:r/>
             <w:r>
-              <w:rPr>
-                <w:i/>
-                <w:color w:val="757575"/>
-                <w:sz w:val="18"/>
-              </w:rPr>
-              <w:t>A situação concreta do seu serviço (e-mails, reuniões, documentos, cadeias de comunicação)</w:t>
+              <w:t>Ao retomar um assunto com uma cadeia longa de e-mails, antes de responder ou agir.</w:t>
             </w:r>
           </w:p>
         </w:tc>
@@ -360,14 +351,60 @@
             <w:tcW w:type="dxa" w:w="4986"/>
           </w:tcPr>
           <w:p>
+            <w:r>
+              <w:t>Vou colar-te uma cadeia de e-mails sobre um processo administrativo numa instituição de ensino superior portuguesa.</w:t>
+            </w:r>
+          </w:p>
+          <w:p>
             <w:r/>
+          </w:p>
+          <w:p>
             <w:r>
-              <w:rPr>
-                <w:i/>
-                <w:color w:val="757575"/>
-                <w:sz w:val="18"/>
-              </w:rPr>
-              <w:t>Descreva a tarefa ao meta-prompt (entrada #0), responda às perguntas dele e cole aqui o prompt final, já revisto por si.</w:t>
+              <w:t>Objetivo: um resumo que me permita retomar o assunto sem reler a cadeia toda.</w:t>
+            </w:r>
+          </w:p>
+          <w:p>
+            <w:r/>
+          </w:p>
+          <w:p>
+            <w:r>
+              <w:t>Faz o seguinte:</w:t>
+            </w:r>
+          </w:p>
+          <w:p>
+            <w:r>
+              <w:t>1. Resume a cadeia em 5 linhas no máximo, por ordem cronológica.</w:t>
+            </w:r>
+          </w:p>
+          <w:p>
+            <w:r>
+              <w:t>2. Lista as decisões já tomadas.</w:t>
+            </w:r>
+          </w:p>
+          <w:p>
+            <w:r>
+              <w:t>3. Lista as pendências: o que falta fazer, quem é o responsável e os prazos referidos.</w:t>
+            </w:r>
+          </w:p>
+          <w:p>
+            <w:r>
+              <w:t>4. Indica a que mensagem devo responder primeiro, e porquê.</w:t>
+            </w:r>
+          </w:p>
+          <w:p>
+            <w:r/>
+          </w:p>
+          <w:p>
+            <w:r>
+              <w:t>Expectativas: tópicos curtos, em português de Portugal. Se houver informação contraditória entre mensagens, assinala-a em vez de escolheres uma versão.</w:t>
+            </w:r>
+          </w:p>
+          <w:p>
+            <w:r/>
+          </w:p>
+          <w:p>
+            <w:r>
+              <w:t>Cadeia de e-mails: [colar]</w:t>
             </w:r>
           </w:p>
         </w:tc>
@@ -394,14 +431,8 @@
             <w:tcW w:type="dxa" w:w="4986"/>
           </w:tcPr>
           <w:p>
-            <w:r/>
             <w:r>
-              <w:rPr>
-                <w:i/>
-                <w:color w:val="757575"/>
-                <w:sz w:val="18"/>
-              </w:rPr>
-              <w:t>O que vai verificar no resultado antes de o usar — dados concretos, tom, completude.</w:t>
+              <w:t>Conferir pendências, prazos e responsáveis contra as mensagens originais — datas e nomes são o que a IA mais troca.</w:t>
             </w:r>
           </w:p>
         </w:tc>
@@ -450,14 +481,8 @@
             <w:tcW w:type="dxa" w:w="4986"/>
           </w:tcPr>
           <w:p>
-            <w:r/>
             <w:r>
-              <w:rPr>
-                <w:i/>
-                <w:color w:val="757575"/>
-                <w:sz w:val="18"/>
-              </w:rPr>
-              <w:t>Ex.: um nome curto que descreva a tarefa de redigir</w:t>
+              <w:t>Resposta formal a pedido de estudante</w:t>
             </w:r>
           </w:p>
         </w:tc>
@@ -484,14 +509,8 @@
             <w:tcW w:type="dxa" w:w="4986"/>
           </w:tcPr>
           <w:p>
-            <w:r/>
             <w:r>
-              <w:rPr>
-                <w:i/>
-                <w:color w:val="757575"/>
-                <w:sz w:val="18"/>
-              </w:rPr>
-              <w:t>A situação concreta do seu serviço (ofícios, respostas a e-mails, notas internas, pareceres)</w:t>
+              <w:t>Ao responder a um e-mail de estudante sobre um procedimento académico, quando a informação a transmitir já está decidida.</w:t>
             </w:r>
           </w:p>
         </w:tc>
@@ -518,14 +537,45 @@
             <w:tcW w:type="dxa" w:w="4986"/>
           </w:tcPr>
           <w:p>
+            <w:r>
+              <w:t>Atua como técnico de serviços académicos de uma instituição de ensino superior portuguesa.</w:t>
+            </w:r>
+          </w:p>
+          <w:p>
             <w:r/>
+          </w:p>
+          <w:p>
             <w:r>
-              <w:rPr>
-                <w:i/>
-                <w:color w:val="757575"/>
-                <w:sz w:val="18"/>
-              </w:rPr>
-              <w:t>Descreva a tarefa ao meta-prompt (entrada #0), responda às perguntas dele e cole aqui o prompt final, já revisto por si.</w:t>
+              <w:t>Objetivo: redigir uma resposta por e-mail a um estudante.</w:t>
+            </w:r>
+          </w:p>
+          <w:p>
+            <w:r/>
+          </w:p>
+          <w:p>
+            <w:r>
+              <w:t>Contexto: vou colar-te o e-mail do estudante e, a seguir, a informação que a resposta deve transmitir (a decisão ou o procedimento aplicável). Não inventes regras, prazos nem valores — usa apenas o que eu der.</w:t>
+            </w:r>
+          </w:p>
+          <w:p>
+            <w:r/>
+          </w:p>
+          <w:p>
+            <w:r>
+              <w:t>Expectativas: tom institucional mas acessível, máximo 150 palavras, em português de Portugal. Estrutura: confirmação do pedido, informação, passos seguintes. Se a informação que dei não chegar para responder, faz-me perguntas antes de escreveres.</w:t>
+            </w:r>
+          </w:p>
+          <w:p>
+            <w:r/>
+          </w:p>
+          <w:p>
+            <w:r>
+              <w:t>E-mail do estudante: [colar]</w:t>
+            </w:r>
+          </w:p>
+          <w:p>
+            <w:r>
+              <w:t>Informação a transmitir: [colar]</w:t>
             </w:r>
           </w:p>
         </w:tc>
@@ -552,14 +602,8 @@
             <w:tcW w:type="dxa" w:w="4986"/>
           </w:tcPr>
           <w:p>
-            <w:r/>
             <w:r>
-              <w:rPr>
-                <w:i/>
-                <w:color w:val="757575"/>
-                <w:sz w:val="18"/>
-              </w:rPr>
-              <w:t>O que vai verificar no resultado antes de o usar — dados concretos, tom, completude.</w:t>
+              <w:t>Confirmar que não acrescentou regras, prazos ou valores; verificar nome do estudante e dados concretos antes de enviar.</w:t>
             </w:r>
           </w:p>
         </w:tc>
@@ -608,14 +652,8 @@
             <w:tcW w:type="dxa" w:w="4986"/>
           </w:tcPr>
           <w:p>
-            <w:r/>
             <w:r>
-              <w:rPr>
-                <w:i/>
-                <w:color w:val="757575"/>
-                <w:sz w:val="18"/>
-              </w:rPr>
-              <w:t>Ex.: um nome curto que descreva a tarefa de reformular</w:t>
+              <w:t>Simplificar texto administrativo para publicação</w:t>
             </w:r>
           </w:p>
         </w:tc>
@@ -642,14 +680,8 @@
             <w:tcW w:type="dxa" w:w="4986"/>
           </w:tcPr>
           <w:p>
-            <w:r/>
             <w:r>
-              <w:rPr>
-                <w:i/>
-                <w:color w:val="757575"/>
-                <w:sz w:val="18"/>
-              </w:rPr>
-              <w:t>A situação concreta do seu serviço (melhorar clareza, ajustar tom, simplificar linguagem)</w:t>
+              <w:t>Quando um aviso, ofício ou norma para estudantes ou público geral está escrito em linguagem demasiado técnica ou jurídica.</w:t>
             </w:r>
           </w:p>
         </w:tc>
@@ -676,14 +708,52 @@
             <w:tcW w:type="dxa" w:w="4986"/>
           </w:tcPr>
           <w:p>
+            <w:r>
+              <w:t>Objetivo: reformular o texto abaixo para linguagem clara, sem perder rigor.</w:t>
+            </w:r>
+          </w:p>
+          <w:p>
             <w:r/>
+          </w:p>
+          <w:p>
             <w:r>
-              <w:rPr>
-                <w:i/>
-                <w:color w:val="757575"/>
-                <w:sz w:val="18"/>
-              </w:rPr>
-              <w:t>Descreva a tarefa ao meta-prompt (entrada #0), responda às perguntas dele e cole aqui o prompt final, já revisto por si.</w:t>
+              <w:t>Contexto: é um texto administrativo de uma instituição de ensino superior portuguesa, destinado a [estudantes / público geral].</w:t>
+            </w:r>
+          </w:p>
+          <w:p>
+            <w:r/>
+          </w:p>
+          <w:p>
+            <w:r>
+              <w:t>Expectativas:</w:t>
+            </w:r>
+          </w:p>
+          <w:p>
+            <w:r>
+              <w:t>1. Mantém todos os requisitos, prazos e referências legais — simplifica a forma, não o conteúdo.</w:t>
+            </w:r>
+          </w:p>
+          <w:p>
+            <w:r>
+              <w:t>2. Frases curtas, voz ativa, em português de Portugal.</w:t>
+            </w:r>
+          </w:p>
+          <w:p>
+            <w:r>
+              <w:t>3. Apresenta duas versões: uma fiel à estrutura original e outra com a informação reorganizada (o mais importante primeiro).</w:t>
+            </w:r>
+          </w:p>
+          <w:p>
+            <w:r>
+              <w:t>4. No fim, lista o que alteraste de forma substancial.</w:t>
+            </w:r>
+          </w:p>
+          <w:p>
+            <w:r/>
+          </w:p>
+          <w:p>
+            <w:r>
+              <w:t>Texto a reformular: [colar]</w:t>
             </w:r>
           </w:p>
         </w:tc>
@@ -710,14 +780,8 @@
             <w:tcW w:type="dxa" w:w="4986"/>
           </w:tcPr>
           <w:p>
-            <w:r/>
             <w:r>
-              <w:rPr>
-                <w:i/>
-                <w:color w:val="757575"/>
-                <w:sz w:val="18"/>
-              </w:rPr>
-              <w:t>O que vai verificar no resultado antes de o usar — dados concretos, tom, completude.</w:t>
+              <w:t>Comparar requisitos, prazos e referências legais com o original — têm de lá estar todos, sem exceção.</w:t>
             </w:r>
           </w:p>
         </w:tc>
@@ -766,14 +830,8 @@
             <w:tcW w:type="dxa" w:w="4986"/>
           </w:tcPr>
           <w:p>
-            <w:r/>
             <w:r>
-              <w:rPr>
-                <w:i/>
-                <w:color w:val="757575"/>
-                <w:sz w:val="18"/>
-              </w:rPr>
-              <w:t>Ex.: um nome curto que descreva a tarefa de analisar</w:t>
+              <w:t>Extração de pendências de atas e relatórios</w:t>
             </w:r>
           </w:p>
         </w:tc>
@@ -800,14 +858,8 @@
             <w:tcW w:type="dxa" w:w="4986"/>
           </w:tcPr>
           <w:p>
-            <w:r/>
             <w:r>
-              <w:rPr>
-                <w:i/>
-                <w:color w:val="757575"/>
-                <w:sz w:val="18"/>
-              </w:rPr>
-              <w:t>A situação concreta do seu serviço (identificar pendências, comparar dados, extrair informação-chave)</w:t>
+              <w:t>Ao receber uma ata ou relatório longo, para identificar o que exige ação do seu serviço.</w:t>
             </w:r>
           </w:p>
         </w:tc>
@@ -834,14 +886,55 @@
             <w:tcW w:type="dxa" w:w="4986"/>
           </w:tcPr>
           <w:p>
+            <w:r>
+              <w:t>Objetivo: extrair de um documento as ações que dizem respeito ao meu serviço.</w:t>
+            </w:r>
+          </w:p>
+          <w:p>
             <w:r/>
+          </w:p>
+          <w:p>
             <w:r>
-              <w:rPr>
-                <w:i/>
-                <w:color w:val="757575"/>
-                <w:sz w:val="18"/>
-              </w:rPr>
-              <w:t>Descreva a tarefa ao meta-prompt (entrada #0), responda às perguntas dele e cole aqui o prompt final, já revisto por si.</w:t>
+              <w:t>Contexto: trabalho no serviço de [indicar serviço] de uma instituição de ensino superior portuguesa. Vou colar uma ata ou relatório.</w:t>
+            </w:r>
+          </w:p>
+          <w:p>
+            <w:r/>
+          </w:p>
+          <w:p>
+            <w:r>
+              <w:t>Faz o seguinte:</w:t>
+            </w:r>
+          </w:p>
+          <w:p>
+            <w:r>
+              <w:t>1. Tabela com: ação, responsável, prazo e estado (quando indicado).</w:t>
+            </w:r>
+          </w:p>
+          <w:p>
+            <w:r>
+              <w:t>2. Destaca as ações que envolvem o meu serviço, direta ou indiretamente.</w:t>
+            </w:r>
+          </w:p>
+          <w:p>
+            <w:r>
+              <w:t>3. Lista as ambiguidades: ações sem responsável ou sem prazo.</w:t>
+            </w:r>
+          </w:p>
+          <w:p>
+            <w:r/>
+          </w:p>
+          <w:p>
+            <w:r>
+              <w:t>Expectativas: não inventes responsáveis nem prazos — se o documento não os indicar, escreve "não indicado". Português de Portugal.</w:t>
+            </w:r>
+          </w:p>
+          <w:p>
+            <w:r/>
+          </w:p>
+          <w:p>
+            <w:r>
+              <w:t>Documento: [colar]</w:t>
             </w:r>
           </w:p>
         </w:tc>
@@ -868,14 +961,8 @@
             <w:tcW w:type="dxa" w:w="4986"/>
           </w:tcPr>
           <w:p>
-            <w:r/>
             <w:r>
-              <w:rPr>
-                <w:i/>
-                <w:color w:val="757575"/>
-                <w:sz w:val="18"/>
-              </w:rPr>
-              <w:t>O que vai verificar no resultado antes de o usar — dados concretos, tom, completude.</w:t>
+              <w:t>Conferir a tabela contra o documento, sobretudo as ações "indiretas" — é onde a IA mais erra por excesso de interpretação.</w:t>
             </w:r>
           </w:p>
         </w:tc>
@@ -924,14 +1011,8 @@
             <w:tcW w:type="dxa" w:w="4986"/>
           </w:tcPr>
           <w:p>
-            <w:r/>
             <w:r>
-              <w:rPr>
-                <w:i/>
-                <w:color w:val="757575"/>
-                <w:sz w:val="18"/>
-              </w:rPr>
-              <w:t>Ex.: um nome curto que descreva a tarefa de preparar</w:t>
+              <w:t>Agenda e dossier de reunião de serviço</w:t>
             </w:r>
           </w:p>
         </w:tc>
@@ -958,14 +1039,8 @@
             <w:tcW w:type="dxa" w:w="4986"/>
           </w:tcPr>
           <w:p>
-            <w:r/>
             <w:r>
-              <w:rPr>
-                <w:i/>
-                <w:color w:val="757575"/>
-                <w:sz w:val="18"/>
-              </w:rPr>
-              <w:t>A situação concreta do seu serviço (agendas, pontos de situação, resumos executivos para reuniões)</w:t>
+              <w:t>Ao preparar uma reunião de serviço ou de coordenação a partir de materiais soltos (e-mails, notas, documentos).</w:t>
             </w:r>
           </w:p>
         </w:tc>
@@ -992,14 +1067,60 @@
             <w:tcW w:type="dxa" w:w="4986"/>
           </w:tcPr>
           <w:p>
+            <w:r>
+              <w:t>Objetivo: preparar uma reunião de trabalho.</w:t>
+            </w:r>
+          </w:p>
+          <w:p>
             <w:r/>
+          </w:p>
+          <w:p>
             <w:r>
-              <w:rPr>
-                <w:i/>
-                <w:color w:val="757575"/>
-                <w:sz w:val="18"/>
-              </w:rPr>
-              <w:t>Descreva a tarefa ao meta-prompt (entrada #0), responda às perguntas dele e cole aqui o prompt final, já revisto por si.</w:t>
+              <w:t>Contexto: vou indicar-te o propósito e a duração da reunião, e colar os materiais disponíveis (e-mails, notas, documentos) de uma instituição de ensino superior portuguesa.</w:t>
+            </w:r>
+          </w:p>
+          <w:p>
+            <w:r/>
+          </w:p>
+          <w:p>
+            <w:r>
+              <w:t>Faz o seguinte:</w:t>
+            </w:r>
+          </w:p>
+          <w:p>
+            <w:r>
+              <w:t>1. Proposta de agenda com tempos por ponto (o total tem de respeitar a duração indicada).</w:t>
+            </w:r>
+          </w:p>
+          <w:p>
+            <w:r>
+              <w:t>2. Para cada ponto: o que já está decidido, o que está em aberto e a pergunta concreta a discutir.</w:t>
+            </w:r>
+          </w:p>
+          <w:p>
+            <w:r>
+              <w:t>3. Lista do que falta saber antes da reunião.</w:t>
+            </w:r>
+          </w:p>
+          <w:p>
+            <w:r/>
+          </w:p>
+          <w:p>
+            <w:r>
+              <w:t>Expectativas: agenda em tabela, o resto em tópicos curtos, português de Portugal. Se os materiais não cobrirem o propósito da reunião, diz o que falta em vez de preencheres com generalidades.</w:t>
+            </w:r>
+          </w:p>
+          <w:p>
+            <w:r/>
+          </w:p>
+          <w:p>
+            <w:r>
+              <w:t>Propósito e duração: [indicar]</w:t>
+            </w:r>
+          </w:p>
+          <w:p>
+            <w:r>
+              <w:t>Materiais: [colar]</w:t>
             </w:r>
           </w:p>
         </w:tc>
@@ -1026,14 +1147,8 @@
             <w:tcW w:type="dxa" w:w="4986"/>
           </w:tcPr>
           <w:p>
-            <w:r/>
             <w:r>
-              <w:rPr>
-                <w:i/>
-                <w:color w:val="757575"/>
-                <w:sz w:val="18"/>
-              </w:rPr>
-              <w:t>O que vai verificar no resultado antes de o usar — dados concretos, tom, completude.</w:t>
+              <w:t>Ajustar tempos e cortar pontos — a agenda proposta é um rascunho de trabalho, não a versão final.</w:t>
             </w:r>
           </w:p>
         </w:tc>

</xml_diff>